<commit_message>
Lay-reader pass, module 02 (TASKS 20): plain-language opening in README, notebook and report, first-use explanations (basis set, scale factor, charge names, cm-1), shared modules/GLOSSARY.md; notebook and report rebuilt
Co-Authored-By: Claude Fable 5.1 <noreply@anthropic.com>
</commit_message>
<xml_diff>
--- a/plans/05_delta-probed-ir-pipeline/modules/02_opponent_atlas/module_summary.docx
+++ b/plans/05_delta-probed-ir-pipeline/modules/02_opponent_atlas/module_summary.docx
@@ -197,6 +197,15 @@
       </w:r>
     </w:p>
     <w:p>
+      <w:r>
+        <w:rPr>
+          <w:b w:val="0"/>
+          <w:i w:val="0"/>
+        </w:rPr>
+        <w:t>For a reader without chemistry: molecules vibrate, and each vibration absorbs infrared light at one colour; the list of those colours (positions, given in the unit cm⁻¹) with their strengths (intensities) is the molecule's infrared spectrum, and astronomers use such spectra to tell which molecules are present in space. The library studied here holds such spectra, computed rather than measured, for thousands of flat carbon-ring molecules (PAHs). Two technical terms recur: the basis set is the resolution of a calculation (a larger one is more accurate and more expensive), and a scale factor is a number slightly below one by which computed positions are multiplied to bring them closer to measurements. A one-page glossary accompanies the modules (GLOSSARY.md in the repository).</w:t>
+      </w:r>
+    </w:p>
+    <w:p>
       <w:pPr>
         <w:ind w:firstLine="0"/>
         <w:jc w:val="center"/>
@@ -214,7 +223,7 @@
           <w:b w:val="0"/>
           <w:i w:val="0"/>
         </w:rPr>
-        <w:t>PAHdb is a library of computed infrared spectra of polycyclic aromatic hydrocarbons and related species, maintained at NASA Ames (Boersma et al., 2014; Ricca et al., 2026). Each species record carries a formula, an electric charge, element counts, the point-group symmetry, the quantum-chemical method and basis set (written only in a free-text route line), and a list of vibrational transitions, each with a frequency, an intensity in km/mol and the scale factor applied to it. The species table I derived has 10,749 rows (4,479 neutral molecules, 2,162 cations, 2,868 dications, 1,231 anions and 9 trications) and 27 columns; the band table has 2,517,399 rows. The key variables I focused on were the carbon count, the charge, the basis set, the stored scale factor, the band position and intensity, and a frequency-range family label that I added for exploration only.</w:t>
+        <w:t>PAHdb is a library of computed infrared spectra of polycyclic aromatic hydrocarbons and related species, maintained at NASA Ames (Boersma et al., 2014; Ricca et al., 2026). Each species record carries a formula, an electric charge, element counts, the point-group symmetry, the quantum-chemical method and basis set (written only in a free-text route line), and a list of vibrational transitions, each with a frequency, an intensity in km/mol and the scale factor applied to it. The species table I derived has 10,749 rows (4,479 neutral molecules, 2,162 cations with one positive charge, 2,868 dications with two, 1,231 anions with one negative charge, and 9 trications) and 27 columns; the band table has 2,517,399 rows. The key variables I focused on were the carbon count, the charge, the basis set, the stored scale factor, the band position and intensity, and a frequency-range family label that I added for exploration only.</w:t>
       </w:r>
     </w:p>
     <w:p>

</xml_diff>

<commit_message>
Module 02 without the PAHdb experimental library (the user, 18 Oct: 'Haal de referentie naar experimental en figure maar uit module 02'): it is module 03's dataset; no longer loaded, no longer a row of Figure 4 (four comparison lines remain, so the EDA function keeps its figure); summary and REPORT counts follow; notebook and summary rebuilt (0 errors, every cell executed)
Co-Authored-By: Claude Opus 5.5 <noreply@anthropic.com>
</commit_message>
<xml_diff>
--- a/plans/05_delta-probed-ir-pipeline/modules/02_opponent_atlas/module_summary.docx
+++ b/plans/05_delta-probed-ir-pipeline/modules/02_opponent_atlas/module_summary.docx
@@ -244,7 +244,7 @@
           <w:b w:val="0"/>
           <w:i w:val="0"/>
         </w:rPr>
-        <w:t>Ingestion: a streaming XML parser (Python's iterparse) reads the 503 MB unpacked file in a few minutes and writes one row per species and one row per band, together with the SHA-256 checksum of the source file and the XML root attributes, so that the version is pinned by content rather than by file name. The notebook then loads the species table with pandas and displays its first rows. Cleaning: two documented functions separate the charge suffix from the formula string and flag species whose basis set cannot be resolved from the route line. Exploratory analysis: one documented function counts species per rung of my project's test ladder for each of five comparison lines. Visualizations: five titled and labelled figures. Summary: findings, assumptions and limitations in the notebook's final section. The whole notebook is rebuilt and executed by a script, so a reviewer obtains the same figures from the same tables; this follows the guidance that a data-science workflow should be re-runnable from its inputs without manual steps (Danchev, 2022).</w:t>
+        <w:t>Ingestion: a streaming XML parser (Python's iterparse) reads the 503 MB unpacked file in a few minutes and writes one row per species and one row per band, together with the SHA-256 checksum of the source file and the XML root attributes, so that the version is pinned by content rather than by file name. The notebook then loads the species table with pandas and displays its first rows. Cleaning: two documented functions separate the charge suffix from the formula string and flag species whose basis set cannot be resolved from the route line. Exploratory analysis: one documented function counts species per rung of my project's test ladder for each of four comparison lines. Visualizations: five titled and labelled figures. Summary: findings, assumptions and limitations in the notebook's final section. The whole notebook is rebuilt and executed by a script, so a reviewer obtains the same figures from the same tables; this follows the guidance that a data-science workflow should be re-runnable from its inputs without manual steps (Danchev, 2022).</w:t>
       </w:r>
     </w:p>
     <w:p>
@@ -530,7 +530,7 @@
           <w:b w:val="0"/>
           <w:i w:val="0"/>
         </w:rPr>
-        <w:t>Figure 4 shows the second surprise: benzene, the project's first test molecule, is in no library except the small anharmonic one. The smallest entries of the computed library are phenol- and indene-like species; the smallest plain PAH is naphthalene. From naphthalene upward all five lines have entries; above coronene only the computed library and the machine-learning simulation of Mai et al. (2025) remain, and above 216 carbons only the computed library.</w:t>
+        <w:t>Figure 4 shows the second surprise: benzene, the project's first test molecule, is in no library except the small anharmonic one. The smallest entries of the computed library are phenol- and indene-like species; the smallest plain PAH is naphthalene. From naphthalene upward all four lines have entries; above coronene only the computed library and the machine-learning simulation of Mai et al. (2025) remain, and above 216 carbons only the computed library.</w:t>
       </w:r>
     </w:p>
     <w:p>

</xml_diff>